<commit_message>
avances y correcciones en los modulos y seguridad
</commit_message>
<xml_diff>
--- a/Requisitos Funcionales AppRecFac.docx
+++ b/Requisitos Funcionales AppRecFac.docx
@@ -1,6 +1,6 @@
 
 <file path=word/document.xml><?xml version="1.0" encoding="utf-8"?>
-<w:document xmlns:wpc="http://schemas.microsoft.com/office/word/2010/wordprocessingCanvas" xmlns:cx="http://schemas.microsoft.com/office/drawing/2014/chartex" xmlns:mc="http://schemas.openxmlformats.org/markup-compatibility/2006" xmlns:o="urn:schemas-microsoft-com:office:office" xmlns:r="http://schemas.openxmlformats.org/officeDocument/2006/relationships" xmlns:m="http://schemas.openxmlformats.org/officeDocument/2006/math" xmlns:v="urn:schemas-microsoft-com:vml" xmlns:wp14="http://schemas.microsoft.com/office/word/2010/wordprocessingDrawing" xmlns:wp="http://schemas.openxmlformats.org/drawingml/2006/wordprocessingDrawing" xmlns:w10="urn:schemas-microsoft-com:office:word" xmlns:w="http://schemas.openxmlformats.org/wordprocessingml/2006/main" xmlns:w14="http://schemas.microsoft.com/office/word/2010/wordml" xmlns:w15="http://schemas.microsoft.com/office/word/2012/wordml" xmlns:w16se="http://schemas.microsoft.com/office/word/2015/wordml/symex" xmlns:wpg="http://schemas.microsoft.com/office/word/2010/wordprocessingGroup" xmlns:wpi="http://schemas.microsoft.com/office/word/2010/wordprocessingInk" xmlns:wne="http://schemas.microsoft.com/office/word/2006/wordml" xmlns:wps="http://schemas.microsoft.com/office/word/2010/wordprocessingShape" mc:Ignorable="w14 w15 w16se wp14">
+<w:document xmlns:wpc="http://schemas.microsoft.com/office/word/2010/wordprocessingCanvas" xmlns:cx="http://schemas.microsoft.com/office/drawing/2014/chartex" xmlns:cx1="http://schemas.microsoft.com/office/drawing/2015/9/8/chartex" xmlns:cx2="http://schemas.microsoft.com/office/drawing/2015/10/21/chartex" xmlns:cx3="http://schemas.microsoft.com/office/drawing/2016/5/9/chartex" xmlns:cx4="http://schemas.microsoft.com/office/drawing/2016/5/10/chartex" xmlns:cx5="http://schemas.microsoft.com/office/drawing/2016/5/11/chartex" xmlns:cx6="http://schemas.microsoft.com/office/drawing/2016/5/12/chartex" xmlns:cx7="http://schemas.microsoft.com/office/drawing/2016/5/13/chartex" xmlns:cx8="http://schemas.microsoft.com/office/drawing/2016/5/14/chartex" xmlns:mc="http://schemas.openxmlformats.org/markup-compatibility/2006" xmlns:aink="http://schemas.microsoft.com/office/drawing/2016/ink" xmlns:am3d="http://schemas.microsoft.com/office/drawing/2017/model3d" xmlns:o="urn:schemas-microsoft-com:office:office" xmlns:oel="http://schemas.microsoft.com/office/2019/extlst" xmlns:r="http://schemas.openxmlformats.org/officeDocument/2006/relationships" xmlns:m="http://schemas.openxmlformats.org/officeDocument/2006/math" xmlns:v="urn:schemas-microsoft-com:vml" xmlns:wp14="http://schemas.microsoft.com/office/word/2010/wordprocessingDrawing" xmlns:wp="http://schemas.openxmlformats.org/drawingml/2006/wordprocessingDrawing" xmlns:w10="urn:schemas-microsoft-com:office:word" xmlns:w="http://schemas.openxmlformats.org/wordprocessingml/2006/main" xmlns:w14="http://schemas.microsoft.com/office/word/2010/wordml" xmlns:w15="http://schemas.microsoft.com/office/word/2012/wordml" xmlns:w16cex="http://schemas.microsoft.com/office/word/2018/wordml/cex" xmlns:w16cid="http://schemas.microsoft.com/office/word/2016/wordml/cid" xmlns:w16="http://schemas.microsoft.com/office/word/2018/wordml" xmlns:w16du="http://schemas.microsoft.com/office/word/2023/wordml/word16du" xmlns:w16sdtdh="http://schemas.microsoft.com/office/word/2020/wordml/sdtdatahash" xmlns:w16sdtfl="http://schemas.microsoft.com/office/word/2024/wordml/sdtformatlock" xmlns:w16se="http://schemas.microsoft.com/office/word/2015/wordml/symex" xmlns:wpg="http://schemas.microsoft.com/office/word/2010/wordprocessingGroup" xmlns:wpi="http://schemas.microsoft.com/office/word/2010/wordprocessingInk" xmlns:wne="http://schemas.microsoft.com/office/word/2006/wordml" xmlns:wps="http://schemas.microsoft.com/office/word/2010/wordprocessingShape" mc:Ignorable="w14 w15 w16se w16cid w16 w16cex w16sdtdh w16sdtfl w16du wp14">
   <w:body>
     <w:p>
       <w:pPr>
@@ -18949,6 +18949,17 @@
         </w:rPr>
         <w:t xml:space="preserve"> corre en CPU</w:t>
       </w:r>
+      <w:r>
+        <w:rPr>
+          <w:rFonts w:ascii="Arial" w:eastAsia="Times New Roman" w:hAnsi="Arial" w:cs="Times New Roman"/>
+          <w:i/>
+          <w:color w:val="0000FF"/>
+          <w:sz w:val="20"/>
+          <w:szCs w:val="24"/>
+          <w:lang w:val="es-ES" w:eastAsia="es-ES"/>
+        </w:rPr>
+        <w:br/>
+      </w:r>
     </w:p>
     <w:p>
       <w:pPr>
@@ -18972,8 +18983,6 @@
           <w:lang w:val="es-EC" w:eastAsia="es-ES"/>
         </w:rPr>
       </w:pPr>
-      <w:bookmarkStart w:id="5" w:name="_GoBack"/>
-      <w:bookmarkEnd w:id="5"/>
     </w:p>
     <w:p>
       <w:pPr>
@@ -19054,7 +19063,6 @@
                 <w:szCs w:val="24"/>
                 <w:lang w:val="es-ES" w:eastAsia="es-ES"/>
               </w:rPr>
-              <w:lastRenderedPageBreak/>
               <w:t>Número de requisito</w:t>
             </w:r>
           </w:p>
@@ -23741,1440 +23749,657 @@
     <w:p>
       <w:pPr>
         <w:spacing w:after="0" w:line="240" w:lineRule="auto"/>
-        <w:ind w:left="360"/>
-        <w:rPr>
-          <w:lang w:val="es-EC"/>
-        </w:rPr>
       </w:pPr>
     </w:p>
     <w:p>
       <w:pPr>
         <w:spacing w:after="0" w:line="240" w:lineRule="auto"/>
-        <w:ind w:left="360"/>
-        <w:rPr>
-          <w:lang w:val="es-EC"/>
-        </w:rPr>
       </w:pPr>
     </w:p>
     <w:p>
       <w:pPr>
         <w:spacing w:after="0" w:line="240" w:lineRule="auto"/>
-        <w:ind w:left="360"/>
-        <w:rPr>
-          <w:lang w:val="es-EC"/>
-        </w:rPr>
       </w:pPr>
     </w:p>
     <w:p>
       <w:pPr>
         <w:spacing w:after="0" w:line="240" w:lineRule="auto"/>
-        <w:ind w:left="360"/>
-        <w:rPr>
-          <w:lang w:val="es-EC"/>
-        </w:rPr>
       </w:pPr>
     </w:p>
     <w:p>
       <w:pPr>
         <w:spacing w:after="0" w:line="240" w:lineRule="auto"/>
-        <w:ind w:left="360"/>
-        <w:rPr>
-          <w:lang w:val="es-EC"/>
-        </w:rPr>
       </w:pPr>
     </w:p>
     <w:p>
       <w:pPr>
         <w:spacing w:after="0" w:line="240" w:lineRule="auto"/>
-        <w:ind w:left="360"/>
-        <w:rPr>
-          <w:lang w:val="es-EC"/>
-        </w:rPr>
       </w:pPr>
     </w:p>
     <w:p>
       <w:pPr>
-        <w:jc w:val="center"/>
+        <w:spacing w:after="0" w:line="240" w:lineRule="auto"/>
+      </w:pPr>
+    </w:p>
+    <w:p>
+      <w:pPr>
+        <w:spacing w:after="0" w:line="240" w:lineRule="auto"/>
         <w:rPr>
           <w:b/>
+          <w:bCs/>
           <w:lang w:val="es-EC"/>
         </w:rPr>
       </w:pPr>
       <w:r>
         <w:rPr>
           <w:b/>
+          <w:bCs/>
           <w:lang w:val="es-EC"/>
         </w:rPr>
-        <w:t>ADMINISTRADOR</w:t>
+        <w:lastRenderedPageBreak/>
+        <w:t xml:space="preserve">Modelos de </w:t>
       </w:r>
-    </w:p>
-    <w:p>
-      <w:pPr>
-        <w:jc w:val="both"/>
-        <w:rPr>
-          <w:b/>
-          <w:sz w:val="24"/>
-          <w:lang w:val="es-EC"/>
-        </w:rPr>
-      </w:pPr>
       <w:r>
         <w:rPr>
           <w:b/>
-          <w:sz w:val="24"/>
+          <w:bCs/>
           <w:lang w:val="es-EC"/>
         </w:rPr>
-        <w:t>Gestión de Invitaciones</w:t>
+        <w:t xml:space="preserve">reconocimiento facial de </w:t>
       </w:r>
-    </w:p>
-    <w:p>
-      <w:pPr>
-        <w:jc w:val="both"/>
-        <w:rPr>
-          <w:b/>
-          <w:lang w:val="es-EC"/>
-        </w:rPr>
-      </w:pPr>
       <w:proofErr w:type="spellStart"/>
       <w:r>
         <w:rPr>
           <w:b/>
+          <w:bCs/>
           <w:lang w:val="es-EC"/>
         </w:rPr>
-        <w:t>Submódulo</w:t>
+        <w:t>InsightFace</w:t>
       </w:r>
       <w:proofErr w:type="spellEnd"/>
       <w:r>
         <w:rPr>
           <w:b/>
+          <w:bCs/>
           <w:lang w:val="es-EC"/>
         </w:rPr>
-        <w:t xml:space="preserve">: </w:t>
-      </w:r>
-      <w:r>
-        <w:rPr>
-          <w:lang w:val="es-EC"/>
-        </w:rPr>
-        <w:t>Invitaciones por cupos</w:t>
-      </w:r>
-    </w:p>
-    <w:p>
-      <w:pPr>
-        <w:ind w:left="360"/>
-        <w:jc w:val="both"/>
-        <w:rPr>
-          <w:b/>
-          <w:lang w:val="es-EC"/>
-        </w:rPr>
-      </w:pPr>
-      <w:r>
-        <w:rPr>
-          <w:b/>
-          <w:lang w:val="es-EC"/>
-        </w:rPr>
-        <w:lastRenderedPageBreak/>
-        <w:t>Requisitos funcionales</w:t>
-      </w:r>
-    </w:p>
-    <w:p>
-      <w:pPr>
-        <w:pStyle w:val="Prrafodelista"/>
-        <w:numPr>
-          <w:ilvl w:val="0"/>
-          <w:numId w:val="1"/>
-        </w:numPr>
-        <w:ind w:left="720"/>
-        <w:jc w:val="both"/>
-        <w:rPr>
-          <w:lang w:val="es-EC"/>
-        </w:rPr>
-      </w:pPr>
-      <w:r>
-        <w:rPr>
-          <w:lang w:val="es-EC"/>
-        </w:rPr>
-        <w:t>El administrador crea una invitación para un titular co</w:t>
-      </w:r>
-      <w:r>
-        <w:rPr>
-          <w:lang w:val="es-EC"/>
-        </w:rPr>
-        <w:t>n cupo fijo (default 3</w:t>
-      </w:r>
-      <w:r>
-        <w:rPr>
-          <w:lang w:val="es-EC"/>
-        </w:rPr>
-        <w:t>), ingresando cédula, código dactilar, email y teléfono.</w:t>
-      </w:r>
-    </w:p>
-    <w:p>
-      <w:pPr>
-        <w:pStyle w:val="Prrafodelista"/>
-        <w:numPr>
-          <w:ilvl w:val="0"/>
-          <w:numId w:val="1"/>
-        </w:numPr>
-        <w:ind w:left="720"/>
-        <w:jc w:val="both"/>
-        <w:rPr>
-          <w:lang w:val="es-EC"/>
-        </w:rPr>
-      </w:pPr>
-      <w:r>
-        <w:rPr>
-          <w:i/>
-          <w:lang w:val="es-EC"/>
-        </w:rPr>
-        <w:t>Pendiente de implementación:</w:t>
-      </w:r>
-      <w:r>
-        <w:rPr>
-          <w:lang w:val="es-EC"/>
-        </w:rPr>
-        <w:t xml:space="preserve"> consulta a API externa por cédula/RUC para autocompletar nombres/email/teléfono/código dactilar desde “Buscar datos”.</w:t>
-      </w:r>
-    </w:p>
-    <w:p>
-      <w:pPr>
-        <w:pStyle w:val="Prrafodelista"/>
-        <w:numPr>
-          <w:ilvl w:val="0"/>
-          <w:numId w:val="1"/>
-        </w:numPr>
-        <w:ind w:left="720"/>
-        <w:jc w:val="both"/>
-        <w:rPr>
-          <w:lang w:val="es-EC"/>
-        </w:rPr>
-      </w:pPr>
-      <w:r>
-        <w:rPr>
-          <w:lang w:val="es-EC"/>
-        </w:rPr>
-        <w:t xml:space="preserve">El sistema genera un link único de </w:t>
-      </w:r>
-      <w:proofErr w:type="spellStart"/>
-      <w:r>
-        <w:rPr>
-          <w:lang w:val="es-EC"/>
-        </w:rPr>
-        <w:t>autoregistro</w:t>
-      </w:r>
-      <w:proofErr w:type="spellEnd"/>
-      <w:r>
-        <w:rPr>
-          <w:lang w:val="es-EC"/>
-        </w:rPr>
-        <w:t xml:space="preserve"> para que el titular registre sus acompañantes hasta agotar cupos.</w:t>
-      </w:r>
-    </w:p>
-    <w:p>
-      <w:pPr>
-        <w:pStyle w:val="Prrafodelista"/>
-        <w:numPr>
-          <w:ilvl w:val="0"/>
-          <w:numId w:val="1"/>
-        </w:numPr>
-        <w:ind w:left="720"/>
-        <w:jc w:val="both"/>
-        <w:rPr>
-          <w:lang w:val="es-EC"/>
-        </w:rPr>
-      </w:pPr>
-      <w:r>
-        <w:rPr>
-          <w:lang w:val="es-EC"/>
-        </w:rPr>
-        <w:t>Se registra estado, cupos consumidos y la marca de intransferible.</w:t>
-      </w:r>
-    </w:p>
-    <w:p>
-      <w:pPr>
-        <w:pStyle w:val="Prrafodelista"/>
-        <w:numPr>
-          <w:ilvl w:val="0"/>
-          <w:numId w:val="1"/>
-        </w:numPr>
-        <w:ind w:left="720"/>
-        <w:jc w:val="both"/>
-        <w:rPr>
-          <w:lang w:val="es-EC"/>
-        </w:rPr>
-      </w:pPr>
-      <w:r>
-        <w:rPr>
-          <w:lang w:val="es-EC"/>
-        </w:rPr>
-        <w:t>Envío automático del link por correo al titular; acciones de copiar o reenviar el link.</w:t>
-      </w:r>
-    </w:p>
-    <w:p>
-      <w:pPr>
-        <w:pStyle w:val="Prrafodelista"/>
-        <w:numPr>
-          <w:ilvl w:val="0"/>
-          <w:numId w:val="1"/>
-        </w:numPr>
-        <w:ind w:left="720"/>
-        <w:jc w:val="both"/>
-        <w:rPr>
-          <w:lang w:val="es-EC"/>
-        </w:rPr>
-      </w:pPr>
-      <w:r>
-        <w:rPr>
-          <w:lang w:val="es-EC"/>
-        </w:rPr>
-        <w:t>La UI lista titular, evento, cupos usados/total, estado, link y acciones (copiar, enviar/reenviar</w:t>
-      </w:r>
-      <w:r>
-        <w:rPr>
-          <w:lang w:val="es-EC"/>
-        </w:rPr>
-        <w:t xml:space="preserve"> correo</w:t>
-      </w:r>
-      <w:r>
-        <w:rPr>
-          <w:lang w:val="es-EC"/>
-        </w:rPr>
-        <w:t>).</w:t>
-      </w:r>
-    </w:p>
-    <w:p>
-      <w:pPr>
-        <w:pStyle w:val="Prrafodelista"/>
-        <w:numPr>
-          <w:ilvl w:val="0"/>
-          <w:numId w:val="1"/>
-        </w:numPr>
-        <w:ind w:left="720"/>
-        <w:jc w:val="both"/>
-        <w:rPr>
-          <w:lang w:val="es-EC"/>
-        </w:rPr>
-      </w:pPr>
-      <w:r>
-        <w:rPr>
-          <w:lang w:val="es-EC"/>
-        </w:rPr>
-        <w:t>Al crear se muestra modal “Invitación creada” confirmando el envío del enlace al titular.</w:t>
-      </w:r>
-    </w:p>
-    <w:p>
-      <w:pPr>
-        <w:jc w:val="both"/>
-        <w:rPr>
-          <w:lang w:val="es-EC"/>
-        </w:rPr>
-      </w:pPr>
-      <w:r>
-        <w:rPr>
-          <w:lang w:val="es-EC"/>
-        </w:rPr>
-        <w:t xml:space="preserve">Nota: </w:t>
-      </w:r>
-    </w:p>
-    <w:p>
-      <w:pPr>
-        <w:jc w:val="both"/>
-        <w:rPr>
-          <w:lang w:val="es-EC"/>
-        </w:rPr>
-      </w:pPr>
-      <w:r>
-        <w:rPr>
-          <w:lang w:val="es-EC"/>
-        </w:rPr>
-        <w:t>Un link para 3 acompañantes</w:t>
-      </w:r>
-    </w:p>
-    <w:p>
-      <w:pPr>
-        <w:jc w:val="both"/>
-        <w:rPr>
-          <w:lang w:val="es-EC"/>
-        </w:rPr>
-      </w:pPr>
-      <w:proofErr w:type="spellStart"/>
-      <w:r>
-        <w:rPr>
-          <w:lang w:val="es-EC"/>
-        </w:rPr>
-        <w:t>Qr</w:t>
-      </w:r>
-      <w:proofErr w:type="spellEnd"/>
-      <w:r>
-        <w:rPr>
-          <w:lang w:val="es-EC"/>
-        </w:rPr>
-        <w:t xml:space="preserve"> por cada invitado</w:t>
-      </w:r>
-    </w:p>
-    <w:p>
-      <w:pPr>
-        <w:jc w:val="both"/>
-        <w:rPr>
-          <w:lang w:val="es-EC"/>
-        </w:rPr>
-      </w:pPr>
-      <w:proofErr w:type="spellStart"/>
-      <w:r>
-        <w:rPr>
-          <w:lang w:val="es-EC"/>
-        </w:rPr>
-        <w:t>W</w:t>
-      </w:r>
-      <w:r>
-        <w:rPr>
-          <w:lang w:val="es-EC"/>
-        </w:rPr>
-        <w:t>edding</w:t>
-      </w:r>
-      <w:proofErr w:type="spellEnd"/>
-      <w:r>
-        <w:rPr>
-          <w:lang w:val="es-EC"/>
-        </w:rPr>
-        <w:t xml:space="preserve"> </w:t>
-      </w:r>
-      <w:proofErr w:type="spellStart"/>
-      <w:r>
-        <w:rPr>
-          <w:lang w:val="es-EC"/>
-        </w:rPr>
-        <w:t>planner</w:t>
-      </w:r>
-      <w:proofErr w:type="spellEnd"/>
-      <w:r>
-        <w:rPr>
-          <w:lang w:val="es-EC"/>
-        </w:rPr>
-        <w:t xml:space="preserve"> va hacer el proceso de registro de invitados con un listado que previamente ya solicitaron</w:t>
-      </w:r>
-    </w:p>
-    <w:p>
-      <w:pPr>
-        <w:jc w:val="both"/>
-        <w:rPr>
-          <w:lang w:val="es-EC"/>
-        </w:rPr>
-      </w:pPr>
-      <w:r>
-        <w:rPr>
-          <w:lang w:val="es-EC"/>
-        </w:rPr>
-        <w:t>El invitado con el link de registro solo registraría el rostro de forma biométrica y agregar la foto de la cedula.</w:t>
-      </w:r>
-    </w:p>
-    <w:p>
-      <w:pPr>
-        <w:jc w:val="both"/>
-        <w:rPr>
-          <w:lang w:val="es-EC"/>
-        </w:rPr>
-      </w:pPr>
-      <w:r>
-        <w:rPr>
-          <w:lang w:val="es-EC"/>
-        </w:rPr>
-        <w:t xml:space="preserve">-En </w:t>
-      </w:r>
-      <w:proofErr w:type="spellStart"/>
-      <w:r>
-        <w:rPr>
-          <w:lang w:val="es-EC"/>
-        </w:rPr>
-        <w:t>que</w:t>
-      </w:r>
-      <w:proofErr w:type="spellEnd"/>
-      <w:r>
-        <w:rPr>
-          <w:lang w:val="es-EC"/>
-        </w:rPr>
-        <w:t xml:space="preserve"> momento se </w:t>
-      </w:r>
-      <w:proofErr w:type="spellStart"/>
-      <w:r>
-        <w:rPr>
-          <w:lang w:val="es-EC"/>
-        </w:rPr>
-        <w:t>getionan</w:t>
-      </w:r>
-      <w:proofErr w:type="spellEnd"/>
-      <w:r>
-        <w:rPr>
-          <w:lang w:val="es-EC"/>
-        </w:rPr>
-        <w:t xml:space="preserve"> las contraseñas de los asistentes</w:t>
-      </w:r>
-    </w:p>
-    <w:p>
-      <w:pPr>
-        <w:jc w:val="both"/>
-        <w:rPr>
-          <w:lang w:val="es-EC"/>
-        </w:rPr>
-      </w:pPr>
-      <w:r>
-        <w:rPr>
-          <w:lang w:val="es-EC"/>
-        </w:rPr>
-        <w:t xml:space="preserve">-En </w:t>
-      </w:r>
-      <w:proofErr w:type="spellStart"/>
-      <w:r>
-        <w:rPr>
-          <w:lang w:val="es-EC"/>
-        </w:rPr>
-        <w:t>que</w:t>
-      </w:r>
-      <w:proofErr w:type="spellEnd"/>
-      <w:r>
-        <w:rPr>
-          <w:lang w:val="es-EC"/>
-        </w:rPr>
-        <w:t xml:space="preserve"> momento se genera el </w:t>
-      </w:r>
-      <w:proofErr w:type="spellStart"/>
-      <w:r>
-        <w:rPr>
-          <w:lang w:val="es-EC"/>
-        </w:rPr>
-        <w:t>Qr</w:t>
-      </w:r>
-      <w:proofErr w:type="spellEnd"/>
-    </w:p>
-    <w:p>
-      <w:pPr>
-        <w:jc w:val="both"/>
-        <w:rPr>
-          <w:lang w:val="es-EC"/>
-        </w:rPr>
-      </w:pPr>
-      <w:r>
-        <w:rPr>
-          <w:lang w:val="es-EC"/>
-        </w:rPr>
-        <w:t xml:space="preserve">-Donde </w:t>
-      </w:r>
-      <w:proofErr w:type="spellStart"/>
-      <w:r>
-        <w:rPr>
-          <w:lang w:val="es-EC"/>
-        </w:rPr>
-        <w:t>iria</w:t>
-      </w:r>
-      <w:proofErr w:type="spellEnd"/>
-      <w:r>
-        <w:rPr>
-          <w:lang w:val="es-EC"/>
-        </w:rPr>
-        <w:t xml:space="preserve"> el modal donde </w:t>
-      </w:r>
-      <w:proofErr w:type="spellStart"/>
-      <w:r>
-        <w:rPr>
-          <w:lang w:val="es-EC"/>
-        </w:rPr>
-        <w:t>perzonalizaran</w:t>
-      </w:r>
-      <w:proofErr w:type="spellEnd"/>
-      <w:r>
-        <w:rPr>
-          <w:lang w:val="es-EC"/>
-        </w:rPr>
-        <w:t xml:space="preserve"> el mensaje del correo electrónico </w:t>
-      </w:r>
-    </w:p>
-    <w:p>
-      <w:pPr>
-        <w:jc w:val="both"/>
-        <w:rPr>
-          <w:lang w:val="es-EC"/>
-        </w:rPr>
-      </w:pPr>
-      <w:r>
-        <w:rPr>
-          <w:lang w:val="es-EC"/>
-        </w:rPr>
-        <w:t xml:space="preserve">- </w:t>
-      </w:r>
-      <w:r>
-        <w:rPr>
-          <w:lang w:val="es-EC"/>
-        </w:rPr>
-        <w:t xml:space="preserve">Lo correcto es usar un token único, p. ej. </w:t>
-      </w:r>
-      <w:hyperlink r:id="rId5" w:history="1">
-        <w:r>
-          <w:rPr>
-            <w:rStyle w:val="Hipervnculo"/>
-            <w:lang w:val="es-EC"/>
-          </w:rPr>
-          <w:t>https://app.com/registro/&lt;token</w:t>
-        </w:r>
-      </w:hyperlink>
-      <w:r>
-        <w:rPr>
-          <w:lang w:val="es-EC"/>
-        </w:rPr>
-        <w:t>&gt;</w:t>
-      </w:r>
-      <w:r>
-        <w:rPr>
-          <w:lang w:val="es-EC"/>
-        </w:rPr>
-        <w:t xml:space="preserve"> para el enlace que se envía al correo del invitado</w:t>
-      </w:r>
-    </w:p>
-    <w:p>
-      <w:pPr>
-        <w:jc w:val="both"/>
-        <w:rPr>
-          <w:lang w:val="es-EC"/>
-        </w:rPr>
-      </w:pPr>
-      <w:r>
-        <w:rPr>
-          <w:lang w:val="es-EC"/>
-        </w:rPr>
-        <w:t>-</w:t>
-      </w:r>
-      <w:r>
-        <w:rPr>
-          <w:lang w:val="es-EC"/>
-        </w:rPr>
-        <w:t xml:space="preserve"> Genera el QR (token único) sólo cuando el aprobador marca la invitación como “Aprobada”. Así evitas que circule un QR antes de la validación final.</w:t>
-      </w:r>
-    </w:p>
-    <w:p>
-      <w:pPr>
-        <w:pStyle w:val="Prrafodelista"/>
-        <w:ind w:left="3600"/>
-        <w:jc w:val="both"/>
-        <w:rPr>
-          <w:lang w:val="es-EC"/>
-        </w:rPr>
-      </w:pPr>
-    </w:p>
-    <w:p>
-      <w:pPr>
-        <w:pStyle w:val="Prrafodelista"/>
-        <w:ind w:left="3600"/>
-        <w:jc w:val="both"/>
-        <w:rPr>
-          <w:b/>
-          <w:lang w:val="es-EC"/>
-        </w:rPr>
-      </w:pPr>
-      <w:r>
-        <w:rPr>
-          <w:b/>
-          <w:lang w:val="es-EC"/>
-        </w:rPr>
-        <w:t>INVITADO</w:t>
-      </w:r>
-    </w:p>
-    <w:p>
-      <w:pPr>
-        <w:jc w:val="both"/>
-        <w:rPr>
-          <w:b/>
-          <w:sz w:val="24"/>
-          <w:lang w:val="es-EC"/>
-        </w:rPr>
-      </w:pPr>
-      <w:r>
-        <w:rPr>
-          <w:b/>
-          <w:sz w:val="24"/>
-          <w:lang w:val="es-EC"/>
-        </w:rPr>
-        <w:t>Gestión de Invitaciones</w:t>
-      </w:r>
-    </w:p>
-    <w:p>
-      <w:pPr>
-        <w:jc w:val="both"/>
-        <w:rPr>
-          <w:b/>
-          <w:lang w:val="es-EC"/>
-        </w:rPr>
-      </w:pPr>
-      <w:proofErr w:type="spellStart"/>
-      <w:r>
-        <w:rPr>
-          <w:b/>
-          <w:lang w:val="es-EC"/>
-        </w:rPr>
-        <w:t>Submódulo</w:t>
-      </w:r>
-      <w:proofErr w:type="spellEnd"/>
-      <w:r>
-        <w:rPr>
-          <w:b/>
-          <w:lang w:val="es-EC"/>
-        </w:rPr>
-        <w:t>:</w:t>
-      </w:r>
-    </w:p>
-    <w:p>
-      <w:pPr>
-        <w:jc w:val="both"/>
-        <w:rPr>
-          <w:b/>
-          <w:lang w:val="es-EC"/>
-        </w:rPr>
-      </w:pPr>
-      <w:r>
-        <w:rPr>
-          <w:b/>
-          <w:lang w:val="es-EC"/>
-        </w:rPr>
-        <w:tab/>
-        <w:t>Requisitos funcionales</w:t>
-      </w:r>
-    </w:p>
-    <w:p>
-      <w:pPr>
-        <w:jc w:val="both"/>
-        <w:rPr>
-          <w:b/>
-          <w:lang w:val="es-EC"/>
-        </w:rPr>
-      </w:pPr>
-      <w:r>
-        <w:rPr>
-          <w:b/>
-          <w:lang w:val="es-EC"/>
-        </w:rPr>
-        <w:t>Flujo Propuesto</w:t>
-      </w:r>
-    </w:p>
-    <w:p>
-      <w:pPr>
-        <w:jc w:val="both"/>
-        <w:rPr>
-          <w:b/>
-          <w:lang w:val="es-EC"/>
-        </w:rPr>
-      </w:pPr>
-      <w:r>
-        <w:rPr>
-          <w:b/>
-          <w:lang w:val="es-EC"/>
-        </w:rPr>
-        <w:t xml:space="preserve">Administración </w:t>
-      </w:r>
-    </w:p>
-    <w:p>
-      <w:pPr>
-        <w:pStyle w:val="Prrafodelista"/>
-        <w:numPr>
-          <w:ilvl w:val="0"/>
-          <w:numId w:val="2"/>
-        </w:numPr>
-        <w:jc w:val="both"/>
-        <w:rPr>
-          <w:lang w:val="es-EC"/>
-        </w:rPr>
-      </w:pPr>
-      <w:r>
-        <w:rPr>
-          <w:lang w:val="es-EC"/>
-        </w:rPr>
-        <w:lastRenderedPageBreak/>
-        <w:t>Se registran el titular y acompañantes se genera un link único para el registro de los demás datos (rostro biométrico y foto de las cedula)</w:t>
-      </w:r>
-    </w:p>
-    <w:p>
-      <w:pPr>
-        <w:pStyle w:val="Prrafodelista"/>
-        <w:numPr>
-          <w:ilvl w:val="1"/>
-          <w:numId w:val="2"/>
-        </w:numPr>
-        <w:rPr>
-          <w:lang w:val="es-EC"/>
-        </w:rPr>
-      </w:pPr>
-      <w:r>
-        <w:rPr>
-          <w:lang w:val="es-EC"/>
-        </w:rPr>
-        <w:t xml:space="preserve">Nota: Al crear la invitación generas un </w:t>
-      </w:r>
-      <w:proofErr w:type="spellStart"/>
-      <w:r>
-        <w:rPr>
-          <w:lang w:val="es-EC"/>
-        </w:rPr>
-        <w:t>registration_token</w:t>
-      </w:r>
-      <w:proofErr w:type="spellEnd"/>
-      <w:r>
-        <w:rPr>
-          <w:lang w:val="es-EC"/>
-        </w:rPr>
-        <w:t xml:space="preserve"> único, armas el link </w:t>
+        <w:br/>
       </w:r>
       <w:r>
         <w:rPr>
           <w:b/>
+          <w:bCs/>
           <w:lang w:val="es-EC"/>
         </w:rPr>
-        <w:t>https://tuapp.com/registro/&lt;registration_token&gt;</w:t>
-      </w:r>
-      <w:r>
-        <w:rPr>
-          <w:lang w:val="es-EC"/>
-        </w:rPr>
-        <w:t>, se guarda con el grupo y se envía según la configuración de correos.</w:t>
+        <w:br/>
       </w:r>
     </w:p>
-    <w:p>
-      <w:pPr>
-        <w:rPr>
-          <w:lang w:val="es-EC"/>
-        </w:rPr>
-      </w:pPr>
-      <w:r>
-        <w:rPr>
-          <w:lang w:val="es-EC"/>
-        </w:rPr>
-        <w:t xml:space="preserve">Nota: </w:t>
-      </w:r>
-      <w:hyperlink r:id="rId6" w:history="1">
-        <w:r>
-          <w:rPr>
-            <w:rStyle w:val="Hipervnculo"/>
-            <w:lang w:val="es-EC"/>
-          </w:rPr>
-          <w:t xml:space="preserve"> http://localhost:5173/demo/invitacion-email</w:t>
-        </w:r>
-      </w:hyperlink>
-      <w:r>
-        <w:rPr>
-          <w:lang w:val="es-EC"/>
-        </w:rPr>
-        <w:t xml:space="preserve"> </w:t>
-      </w:r>
-      <w:proofErr w:type="spellStart"/>
-      <w:r>
-        <w:rPr>
-          <w:lang w:val="es-EC"/>
-        </w:rPr>
-        <w:t>aqui</w:t>
-      </w:r>
-      <w:proofErr w:type="spellEnd"/>
-      <w:r>
-        <w:rPr>
-          <w:lang w:val="es-EC"/>
-        </w:rPr>
-        <w:t xml:space="preserve"> se muestra el </w:t>
-      </w:r>
-      <w:proofErr w:type="spellStart"/>
-      <w:r>
-        <w:rPr>
-          <w:lang w:val="es-EC"/>
-        </w:rPr>
-        <w:t>fomato</w:t>
-      </w:r>
-      <w:proofErr w:type="spellEnd"/>
-      <w:r>
-        <w:rPr>
-          <w:lang w:val="es-EC"/>
-        </w:rPr>
-        <w:t xml:space="preserve"> base que llegaría al correo electrónico.</w:t>
-      </w:r>
-    </w:p>
-    <w:p>
-      <w:pPr>
-        <w:pStyle w:val="Prrafodelista"/>
-        <w:numPr>
-          <w:ilvl w:val="0"/>
-          <w:numId w:val="2"/>
-        </w:numPr>
-        <w:jc w:val="both"/>
-        <w:rPr>
-          <w:lang w:val="es-EC"/>
-        </w:rPr>
-      </w:pPr>
-      <w:r>
-        <w:rPr>
-          <w:lang w:val="es-EC"/>
-        </w:rPr>
-        <w:t>Se envía el link para el registro al correo electrónico del titular</w:t>
-      </w:r>
-    </w:p>
-    <w:p>
-      <w:pPr>
-        <w:pStyle w:val="Prrafodelista"/>
-        <w:numPr>
-          <w:ilvl w:val="1"/>
-          <w:numId w:val="2"/>
-        </w:numPr>
-        <w:jc w:val="both"/>
-        <w:rPr>
-          <w:b/>
-          <w:lang w:val="es-EC"/>
-        </w:rPr>
-      </w:pPr>
-      <w:r>
-        <w:rPr>
-          <w:b/>
-          <w:lang w:val="es-EC"/>
-        </w:rPr>
-        <w:t>¿Se debe enviar este enlace único solo al titular o a todos a los que se registraron como acompañantes también?</w:t>
-      </w:r>
-    </w:p>
-    <w:p>
-      <w:pPr>
-        <w:jc w:val="both"/>
-        <w:rPr>
-          <w:b/>
-          <w:lang w:val="es-EC"/>
-        </w:rPr>
-      </w:pPr>
-      <w:r>
-        <w:rPr>
-          <w:b/>
-          <w:lang w:val="es-EC"/>
-        </w:rPr>
-        <w:t>Asistente</w:t>
-      </w:r>
-    </w:p>
-    <w:p>
-      <w:pPr>
-        <w:pStyle w:val="Prrafodelista"/>
-        <w:numPr>
-          <w:ilvl w:val="0"/>
-          <w:numId w:val="2"/>
-        </w:numPr>
-        <w:jc w:val="both"/>
-        <w:rPr>
-          <w:lang w:val="es-EC"/>
-        </w:rPr>
-      </w:pPr>
-      <w:r>
-        <w:rPr>
-          <w:lang w:val="es-EC"/>
-        </w:rPr>
-        <w:t>El invitado abre el link que se le envió el correo electrónico registra su rostro de forma biométrica y adjunta su cedula anverso y reverso. Este mismo paso deberán realizar todos incluyendo titular y acompañante. Una vez culminado el registro todos los integrantes tendrán la opción de enviar registro a espera de la aprobación de las mismas.</w:t>
-      </w:r>
-    </w:p>
-    <w:p>
-      <w:pPr>
-        <w:jc w:val="both"/>
-      </w:pPr>
-      <w:r>
-        <w:t xml:space="preserve">Link demo: </w:t>
-      </w:r>
-      <w:hyperlink r:id="rId7" w:history="1">
-        <w:r>
-          <w:rPr>
-            <w:rStyle w:val="Hipervnculo"/>
-          </w:rPr>
-          <w:t>http://localhost:5173/demo/registro-landing</w:t>
-        </w:r>
-      </w:hyperlink>
-    </w:p>
-    <w:p>
-      <w:pPr>
-        <w:jc w:val="both"/>
-        <w:rPr>
-          <w:b/>
-          <w:lang w:val="es-EC"/>
-        </w:rPr>
-      </w:pPr>
-      <w:r>
-        <w:rPr>
-          <w:b/>
-          <w:lang w:val="es-EC"/>
-        </w:rPr>
-        <w:t>Aprobador</w:t>
-      </w:r>
-    </w:p>
-    <w:p>
-      <w:pPr>
-        <w:pStyle w:val="Prrafodelista"/>
-        <w:numPr>
-          <w:ilvl w:val="0"/>
-          <w:numId w:val="2"/>
-        </w:numPr>
-        <w:jc w:val="both"/>
-        <w:rPr>
-          <w:lang w:val="es-EC"/>
-        </w:rPr>
-      </w:pPr>
-      <w:r>
-        <w:rPr>
-          <w:lang w:val="es-EC"/>
-        </w:rPr>
-        <w:t>El aprobador deberá iniciar sesión tendrá un módulo llamado Invitaciones en el cual estará encargado de Revisar datos adjuntos de la cedula, foto biométrica. La aprobación se establecerá en base a los criterios del cliente</w:t>
-      </w:r>
-    </w:p>
-    <w:p>
-      <w:pPr>
-        <w:pStyle w:val="Prrafodelista"/>
-        <w:numPr>
-          <w:ilvl w:val="1"/>
-          <w:numId w:val="2"/>
-        </w:numPr>
-        <w:jc w:val="both"/>
-        <w:rPr>
-          <w:lang w:val="es-EC"/>
-        </w:rPr>
-      </w:pPr>
-      <w:r>
-        <w:rPr>
-          <w:lang w:val="es-EC"/>
-        </w:rPr>
-        <w:t xml:space="preserve">El criterio de aprobación se podría hacer en base a una fecha tope de registro del rostro y adjunto de cedulas en la cual el aprobador procederá a aprobar a los invitados por lote o uno por uno (grupos de invitaciones de 3) ejecutando una revisión </w:t>
-      </w:r>
-    </w:p>
-    <w:p>
-      <w:pPr>
-        <w:pStyle w:val="Prrafodelista"/>
-        <w:numPr>
-          <w:ilvl w:val="1"/>
-          <w:numId w:val="2"/>
-        </w:numPr>
-        <w:jc w:val="both"/>
-        <w:rPr>
-          <w:b/>
-          <w:lang w:val="es-EC"/>
-        </w:rPr>
-      </w:pPr>
-      <w:r>
-        <w:rPr>
-          <w:b/>
-          <w:lang w:val="es-EC"/>
-        </w:rPr>
-        <w:t>¿En la aprobación se podrá realizar si todos completaron el registro completo o no importaría este apartado?</w:t>
-      </w:r>
-    </w:p>
-    <w:p>
-      <w:pPr>
-        <w:pStyle w:val="Prrafodelista"/>
-        <w:numPr>
-          <w:ilvl w:val="1"/>
-          <w:numId w:val="2"/>
-        </w:numPr>
-        <w:jc w:val="both"/>
-        <w:rPr>
-          <w:b/>
-          <w:lang w:val="es-EC"/>
-        </w:rPr>
-      </w:pPr>
-      <w:r>
-        <w:rPr>
-          <w:b/>
-          <w:lang w:val="es-EC"/>
-        </w:rPr>
-        <w:t xml:space="preserve">La generación del </w:t>
-      </w:r>
-      <w:proofErr w:type="spellStart"/>
-      <w:r>
-        <w:rPr>
-          <w:b/>
-          <w:lang w:val="es-EC"/>
-        </w:rPr>
-        <w:t>Qr</w:t>
-      </w:r>
-      <w:proofErr w:type="spellEnd"/>
-      <w:r>
-        <w:rPr>
-          <w:b/>
-          <w:lang w:val="es-EC"/>
-        </w:rPr>
-        <w:t xml:space="preserve"> se generaría después de que el aprobador aprueba a los asistentes que cumplen con los requisitos completos de registro. Los mismos que se enviaran al correo de cada invitado aprobado.</w:t>
-      </w:r>
-    </w:p>
-    <w:p>
-      <w:pPr>
-        <w:jc w:val="both"/>
-      </w:pPr>
-      <w:r>
-        <w:t xml:space="preserve">Link demo: </w:t>
-      </w:r>
-      <w:hyperlink r:id="rId8" w:history="1">
-        <w:r>
-          <w:rPr>
-            <w:rStyle w:val="Hipervnculo"/>
-          </w:rPr>
-          <w:t>http://localhost:5173/approver/pending2</w:t>
-        </w:r>
-      </w:hyperlink>
-    </w:p>
-    <w:p>
-      <w:pPr>
-        <w:jc w:val="both"/>
-        <w:rPr>
-          <w:b/>
-        </w:rPr>
-      </w:pPr>
-      <w:r>
-        <w:rPr>
-          <w:b/>
-        </w:rPr>
-        <w:t>Staff</w:t>
-      </w:r>
-    </w:p>
-    <w:p>
-      <w:pPr>
-        <w:jc w:val="both"/>
-      </w:pPr>
-      <w:r>
-        <w:t>Link demo:</w:t>
-      </w:r>
-      <w:r>
-        <w:t xml:space="preserve"> </w:t>
-      </w:r>
-      <w:hyperlink r:id="rId9" w:history="1">
-        <w:r>
-          <w:rPr>
-            <w:rStyle w:val="Hipervnculo"/>
-          </w:rPr>
-          <w:t>http://localhost:5173/staff/checkin2</w:t>
-        </w:r>
-      </w:hyperlink>
-    </w:p>
-    <w:p>
-      <w:pPr>
-        <w:pStyle w:val="Prrafodelista"/>
-        <w:numPr>
-          <w:ilvl w:val="0"/>
-          <w:numId w:val="2"/>
-        </w:numPr>
-        <w:jc w:val="both"/>
-        <w:rPr>
-          <w:lang w:val="es-EC"/>
-        </w:rPr>
-      </w:pPr>
-      <w:r>
-        <w:rPr>
-          <w:lang w:val="es-EC"/>
-        </w:rPr>
-        <w:t>El staff escanea el QR de cada invitado (el QR se considera desechado después de ser escaneado). Al escanear el QR, se abre un modal con la opción de escaneo biométrico del rostro.</w:t>
-      </w:r>
-      <w:r>
-        <w:rPr>
-          <w:lang w:val="es-EC"/>
-        </w:rPr>
-        <w:t xml:space="preserve"> </w:t>
-      </w:r>
-      <w:r>
-        <w:rPr>
-          <w:lang w:val="es-EC"/>
-        </w:rPr>
-        <w:t xml:space="preserve">El staff debe presionar “Escanear rostro”; el sistema muestra si la validación biométrica fue aprobada o falló. Si la biometría falla, no se puede aprobar automáticamente. En ese caso (y en general, porque es doble verificación), el staff debe </w:t>
-      </w:r>
-      <w:r>
-        <w:rPr>
-          <w:lang w:val="es-EC"/>
-        </w:rPr>
-        <w:lastRenderedPageBreak/>
-        <w:t xml:space="preserve">solicitar la cédula física y compararla con la cédula registrada en pantalla. Para validar la cédula, el staff marca el </w:t>
-      </w:r>
-      <w:proofErr w:type="spellStart"/>
-      <w:r>
-        <w:rPr>
-          <w:lang w:val="es-EC"/>
-        </w:rPr>
-        <w:t>checkbox</w:t>
-      </w:r>
-      <w:proofErr w:type="spellEnd"/>
-      <w:r>
-        <w:rPr>
-          <w:lang w:val="es-EC"/>
-        </w:rPr>
-        <w:t>: “Cédula física verificada por staff (obligatorio)”.</w:t>
-      </w:r>
-    </w:p>
-    <w:p>
-      <w:pPr>
-        <w:jc w:val="both"/>
-        <w:rPr>
-          <w:b/>
-          <w:lang w:val="es-EC"/>
-        </w:rPr>
-      </w:pPr>
-      <w:r>
-        <w:rPr>
-          <w:b/>
-          <w:lang w:val="es-EC"/>
-        </w:rPr>
-        <w:t>Decisión final:</w:t>
-      </w:r>
-    </w:p>
-    <w:p>
-      <w:pPr>
-        <w:ind w:left="720"/>
-        <w:jc w:val="both"/>
-        <w:rPr>
-          <w:lang w:val="es-EC"/>
-        </w:rPr>
-      </w:pPr>
-      <w:r>
-        <w:rPr>
-          <w:lang w:val="es-EC"/>
-        </w:rPr>
-        <w:t xml:space="preserve">Aprobar ingreso solo se habilita si: biometría aprobada + </w:t>
-      </w:r>
-      <w:proofErr w:type="spellStart"/>
-      <w:r>
-        <w:rPr>
-          <w:lang w:val="es-EC"/>
-        </w:rPr>
-        <w:t>checkbox</w:t>
-      </w:r>
-      <w:proofErr w:type="spellEnd"/>
-      <w:r>
-        <w:rPr>
-          <w:lang w:val="es-EC"/>
-        </w:rPr>
-        <w:t xml:space="preserve"> marcado.</w:t>
-      </w:r>
-    </w:p>
-    <w:p>
-      <w:pPr>
-        <w:ind w:left="720"/>
-        <w:jc w:val="both"/>
-        <w:rPr>
-          <w:lang w:val="es-EC"/>
-        </w:rPr>
-      </w:pPr>
-      <w:r>
-        <w:rPr>
-          <w:lang w:val="es-EC"/>
-        </w:rPr>
-        <w:t xml:space="preserve">Aprobar ingreso manualmente solo se habilita si: biometría falló + </w:t>
-      </w:r>
-      <w:proofErr w:type="spellStart"/>
-      <w:r>
-        <w:rPr>
-          <w:lang w:val="es-EC"/>
-        </w:rPr>
-        <w:t>checkbox</w:t>
-      </w:r>
-      <w:proofErr w:type="spellEnd"/>
-      <w:r>
-        <w:rPr>
-          <w:lang w:val="es-EC"/>
-        </w:rPr>
-        <w:t xml:space="preserve"> marcado.</w:t>
-      </w:r>
-    </w:p>
-    <w:p>
-      <w:pPr>
-        <w:jc w:val="both"/>
-        <w:rPr>
-          <w:b/>
-          <w:lang w:val="es-EC"/>
-        </w:rPr>
-      </w:pPr>
-      <w:r>
-        <w:rPr>
-          <w:b/>
-          <w:lang w:val="es-EC"/>
-        </w:rPr>
-        <w:t>Auditoría:</w:t>
-      </w:r>
-    </w:p>
-    <w:p>
-      <w:pPr>
-        <w:ind w:left="720"/>
-        <w:jc w:val="both"/>
-        <w:rPr>
-          <w:lang w:val="es-EC"/>
-        </w:rPr>
-      </w:pPr>
-      <w:r>
-        <w:rPr>
-          <w:lang w:val="es-EC"/>
-        </w:rPr>
-        <w:t>Cada aprobación queda registrada indicando si fue automática o manual, y queda asociado al personal/puesto que realizó la validación.</w:t>
-      </w:r>
-    </w:p>
-    <w:p>
-      <w:pPr>
-        <w:ind w:left="360"/>
-        <w:jc w:val="both"/>
-        <w:rPr>
-          <w:b/>
-          <w:lang w:val="es-EC"/>
-        </w:rPr>
-      </w:pPr>
-    </w:p>
-    <w:p>
-      <w:pPr>
-        <w:ind w:left="360"/>
-        <w:jc w:val="both"/>
-        <w:rPr>
-          <w:b/>
-          <w:lang w:val="es-EC"/>
-        </w:rPr>
-      </w:pPr>
-    </w:p>
-    <w:p>
-      <w:pPr>
-        <w:ind w:left="360"/>
-        <w:jc w:val="both"/>
-        <w:rPr>
-          <w:b/>
-          <w:lang w:val="es-EC"/>
-        </w:rPr>
-      </w:pPr>
-    </w:p>
-    <w:p>
-      <w:pPr>
-        <w:ind w:left="360"/>
-        <w:jc w:val="both"/>
-        <w:rPr>
-          <w:lang w:val="es-EC"/>
-        </w:rPr>
-      </w:pPr>
-      <w:r>
-        <w:rPr>
-          <w:b/>
-          <w:lang w:val="es-EC"/>
-        </w:rPr>
-        <w:t>Creación de</w:t>
-      </w:r>
-      <w:r>
-        <w:rPr>
-          <w:b/>
-          <w:lang w:val="es-EC"/>
-        </w:rPr>
-        <w:t xml:space="preserve"> cuentas para Aprobador y Staff: </w:t>
-      </w:r>
-      <w:r>
-        <w:rPr>
-          <w:lang w:val="es-EC"/>
-        </w:rPr>
-        <w:t>El Administrador será responsable de crear las cuentas de los usuarios con roles APROBADOR y STAFF.</w:t>
-      </w:r>
-    </w:p>
-    <w:p>
-      <w:pPr>
-        <w:jc w:val="both"/>
-        <w:rPr>
-          <w:b/>
-          <w:lang w:val="es-EC"/>
-        </w:rPr>
-      </w:pPr>
-    </w:p>
-    <w:p>
-      <w:pPr>
-        <w:ind w:left="360"/>
-        <w:jc w:val="both"/>
-        <w:rPr>
-          <w:b/>
-          <w:lang w:val="es-EC"/>
-        </w:rPr>
-      </w:pPr>
-      <w:r>
-        <w:rPr>
-          <w:b/>
-          <w:lang w:val="es-EC"/>
-        </w:rPr>
-        <w:t>Estados</w:t>
-      </w:r>
-    </w:p>
-    <w:p>
-      <w:pPr>
-        <w:ind w:left="360"/>
-        <w:jc w:val="both"/>
-        <w:rPr>
-          <w:b/>
-          <w:lang w:val="es-EC"/>
-        </w:rPr>
-      </w:pPr>
-      <w:r>
-        <w:rPr>
-          <w:b/>
-          <w:lang w:val="es-EC"/>
-        </w:rPr>
-        <w:t xml:space="preserve">Estados por persona – documentos: </w:t>
-      </w:r>
-      <w:r>
-        <w:rPr>
-          <w:lang w:val="es-EC"/>
-        </w:rPr>
-        <w:t>completo | pendiente | observado | aprobado</w:t>
-      </w:r>
-    </w:p>
-    <w:p>
-      <w:pPr>
-        <w:ind w:left="360"/>
-        <w:jc w:val="both"/>
-        <w:rPr>
-          <w:lang w:val="es-EC"/>
-        </w:rPr>
-      </w:pPr>
-      <w:r>
-        <w:rPr>
-          <w:b/>
-          <w:lang w:val="es-EC"/>
-        </w:rPr>
-        <w:t>Estado del grupo</w:t>
-      </w:r>
-      <w:r>
-        <w:rPr>
-          <w:b/>
-          <w:lang w:val="es-EC"/>
-        </w:rPr>
-        <w:t xml:space="preserve">: </w:t>
-      </w:r>
-      <w:r>
-        <w:rPr>
-          <w:lang w:val="es-EC"/>
-        </w:rPr>
-        <w:t>Pendiente | En revisión | Aprobado | Rechazado</w:t>
-      </w:r>
-    </w:p>
-    <w:p>
-      <w:pPr>
-        <w:ind w:left="360"/>
-        <w:jc w:val="both"/>
-        <w:rPr>
-          <w:b/>
-          <w:lang w:val="es-EC"/>
-        </w:rPr>
-      </w:pPr>
-    </w:p>
-    <w:p>
-      <w:pPr>
-        <w:ind w:left="360"/>
-        <w:jc w:val="both"/>
-        <w:rPr>
-          <w:b/>
-          <w:lang w:val="es-EC"/>
-        </w:rPr>
-      </w:pPr>
-    </w:p>
-    <w:p>
-      <w:pPr>
-        <w:ind w:left="360"/>
-        <w:jc w:val="both"/>
-      </w:pPr>
-      <w:r>
-        <w:rPr>
-          <w:b/>
-          <w:lang w:val="es-EC"/>
-        </w:rPr>
-        <w:t xml:space="preserve">Librería: </w:t>
-      </w:r>
-      <w:r>
-        <w:t>face-recognition</w:t>
-      </w:r>
-    </w:p>
+    <w:tbl>
+      <w:tblPr>
+        <w:tblStyle w:val="Tablaconcuadrcula"/>
+        <w:tblW w:w="8075" w:type="dxa"/>
+        <w:tblLook w:val="04A0" w:firstRow="1" w:lastRow="0" w:firstColumn="1" w:lastColumn="0" w:noHBand="0" w:noVBand="1"/>
+      </w:tblPr>
+      <w:tblGrid>
+        <w:gridCol w:w="1223"/>
+        <w:gridCol w:w="1047"/>
+        <w:gridCol w:w="1072"/>
+        <w:gridCol w:w="1120"/>
+        <w:gridCol w:w="1912"/>
+        <w:gridCol w:w="1701"/>
+      </w:tblGrid>
+      <w:tr>
+        <w:tc>
+          <w:tcPr>
+            <w:tcW w:w="0" w:type="auto"/>
+            <w:hideMark/>
+          </w:tcPr>
+          <w:p>
+            <w:pPr>
+              <w:rPr>
+                <w:b/>
+                <w:bCs/>
+              </w:rPr>
+            </w:pPr>
+            <w:proofErr w:type="spellStart"/>
+            <w:r>
+              <w:rPr>
+                <w:b/>
+                <w:bCs/>
+              </w:rPr>
+              <w:t>Modelo</w:t>
+            </w:r>
+            <w:proofErr w:type="spellEnd"/>
+          </w:p>
+        </w:tc>
+        <w:tc>
+          <w:tcPr>
+            <w:tcW w:w="0" w:type="auto"/>
+            <w:hideMark/>
+          </w:tcPr>
+          <w:p>
+            <w:pPr>
+              <w:rPr>
+                <w:b/>
+                <w:bCs/>
+              </w:rPr>
+            </w:pPr>
+            <w:proofErr w:type="spellStart"/>
+            <w:r>
+              <w:rPr>
+                <w:b/>
+                <w:bCs/>
+              </w:rPr>
+              <w:t>Precisión</w:t>
+            </w:r>
+            <w:proofErr w:type="spellEnd"/>
+          </w:p>
+        </w:tc>
+        <w:tc>
+          <w:tcPr>
+            <w:tcW w:w="0" w:type="auto"/>
+            <w:hideMark/>
+          </w:tcPr>
+          <w:p>
+            <w:pPr>
+              <w:rPr>
+                <w:b/>
+                <w:bCs/>
+              </w:rPr>
+            </w:pPr>
+            <w:proofErr w:type="spellStart"/>
+            <w:r>
+              <w:rPr>
+                <w:b/>
+                <w:bCs/>
+              </w:rPr>
+              <w:t>Consumo</w:t>
+            </w:r>
+            <w:proofErr w:type="spellEnd"/>
+            <w:r>
+              <w:rPr>
+                <w:b/>
+                <w:bCs/>
+              </w:rPr>
+              <w:t xml:space="preserve"> de </w:t>
+            </w:r>
+            <w:proofErr w:type="spellStart"/>
+            <w:r>
+              <w:rPr>
+                <w:b/>
+                <w:bCs/>
+              </w:rPr>
+              <w:t>recursos</w:t>
+            </w:r>
+            <w:proofErr w:type="spellEnd"/>
+          </w:p>
+        </w:tc>
+        <w:tc>
+          <w:tcPr>
+            <w:tcW w:w="0" w:type="auto"/>
+            <w:hideMark/>
+          </w:tcPr>
+          <w:p>
+            <w:pPr>
+              <w:rPr>
+                <w:b/>
+                <w:bCs/>
+              </w:rPr>
+            </w:pPr>
+            <w:proofErr w:type="spellStart"/>
+            <w:r>
+              <w:rPr>
+                <w:b/>
+                <w:bCs/>
+              </w:rPr>
+              <w:t>Velocidad</w:t>
+            </w:r>
+            <w:proofErr w:type="spellEnd"/>
+            <w:r>
+              <w:rPr>
+                <w:b/>
+                <w:bCs/>
+              </w:rPr>
+              <w:t xml:space="preserve"> </w:t>
+            </w:r>
+            <w:proofErr w:type="spellStart"/>
+            <w:r>
+              <w:rPr>
+                <w:b/>
+                <w:bCs/>
+              </w:rPr>
+              <w:t>en</w:t>
+            </w:r>
+            <w:proofErr w:type="spellEnd"/>
+            <w:r>
+              <w:rPr>
+                <w:b/>
+                <w:bCs/>
+              </w:rPr>
+              <w:t xml:space="preserve"> CPU</w:t>
+            </w:r>
+          </w:p>
+        </w:tc>
+        <w:tc>
+          <w:tcPr>
+            <w:tcW w:w="1912" w:type="dxa"/>
+            <w:hideMark/>
+          </w:tcPr>
+          <w:p>
+            <w:pPr>
+              <w:rPr>
+                <w:b/>
+                <w:bCs/>
+              </w:rPr>
+            </w:pPr>
+            <w:r>
+              <w:rPr>
+                <w:b/>
+                <w:bCs/>
+              </w:rPr>
+              <w:t xml:space="preserve">Uso </w:t>
+            </w:r>
+            <w:proofErr w:type="spellStart"/>
+            <w:r>
+              <w:rPr>
+                <w:b/>
+                <w:bCs/>
+              </w:rPr>
+              <w:t>recomendado</w:t>
+            </w:r>
+            <w:proofErr w:type="spellEnd"/>
+          </w:p>
+        </w:tc>
+        <w:tc>
+          <w:tcPr>
+            <w:tcW w:w="1701" w:type="dxa"/>
+            <w:hideMark/>
+          </w:tcPr>
+          <w:p>
+            <w:pPr>
+              <w:rPr>
+                <w:b/>
+                <w:bCs/>
+              </w:rPr>
+            </w:pPr>
+            <w:r>
+              <w:rPr>
+                <w:b/>
+                <w:bCs/>
+              </w:rPr>
+              <w:t xml:space="preserve">Estado </w:t>
+            </w:r>
+            <w:proofErr w:type="spellStart"/>
+            <w:r>
+              <w:rPr>
+                <w:b/>
+                <w:bCs/>
+              </w:rPr>
+              <w:t>en</w:t>
+            </w:r>
+            <w:proofErr w:type="spellEnd"/>
+            <w:r>
+              <w:rPr>
+                <w:b/>
+                <w:bCs/>
+              </w:rPr>
+              <w:t xml:space="preserve"> </w:t>
+            </w:r>
+            <w:proofErr w:type="spellStart"/>
+            <w:r>
+              <w:rPr>
+                <w:b/>
+                <w:bCs/>
+              </w:rPr>
+              <w:t>tu</w:t>
+            </w:r>
+            <w:proofErr w:type="spellEnd"/>
+            <w:r>
+              <w:rPr>
+                <w:b/>
+                <w:bCs/>
+              </w:rPr>
+              <w:t xml:space="preserve"> </w:t>
+            </w:r>
+            <w:proofErr w:type="spellStart"/>
+            <w:r>
+              <w:rPr>
+                <w:b/>
+                <w:bCs/>
+              </w:rPr>
+              <w:t>entorno</w:t>
+            </w:r>
+            <w:proofErr w:type="spellEnd"/>
+          </w:p>
+        </w:tc>
+      </w:tr>
+      <w:tr>
+        <w:tc>
+          <w:tcPr>
+            <w:tcW w:w="0" w:type="auto"/>
+            <w:hideMark/>
+          </w:tcPr>
+          <w:p>
+            <w:proofErr w:type="spellStart"/>
+            <w:r>
+              <w:t>buffalo_l</w:t>
+            </w:r>
+            <w:proofErr w:type="spellEnd"/>
+          </w:p>
+        </w:tc>
+        <w:tc>
+          <w:tcPr>
+            <w:tcW w:w="0" w:type="auto"/>
+            <w:hideMark/>
+          </w:tcPr>
+          <w:p>
+            <w:r>
+              <w:t>Alta</w:t>
+            </w:r>
+          </w:p>
+        </w:tc>
+        <w:tc>
+          <w:tcPr>
+            <w:tcW w:w="0" w:type="auto"/>
+            <w:hideMark/>
+          </w:tcPr>
+          <w:p>
+            <w:r>
+              <w:t>Alto</w:t>
+            </w:r>
+          </w:p>
+        </w:tc>
+        <w:tc>
+          <w:tcPr>
+            <w:tcW w:w="0" w:type="auto"/>
+            <w:hideMark/>
+          </w:tcPr>
+          <w:p>
+            <w:r>
+              <w:t>Media-baja</w:t>
+            </w:r>
+          </w:p>
+        </w:tc>
+        <w:tc>
+          <w:tcPr>
+            <w:tcW w:w="1912" w:type="dxa"/>
+            <w:hideMark/>
+          </w:tcPr>
+          <w:p>
+            <w:pPr>
+              <w:rPr>
+                <w:lang w:val="es-EC"/>
+              </w:rPr>
+            </w:pPr>
+            <w:r>
+              <w:rPr>
+                <w:lang w:val="es-EC"/>
+              </w:rPr>
+              <w:t>Control de acceso con foco en exactitud</w:t>
+            </w:r>
+          </w:p>
+        </w:tc>
+        <w:tc>
+          <w:tcPr>
+            <w:tcW w:w="1701" w:type="dxa"/>
+          </w:tcPr>
+          <w:p/>
+        </w:tc>
+      </w:tr>
+      <w:tr>
+        <w:tc>
+          <w:tcPr>
+            <w:tcW w:w="0" w:type="auto"/>
+            <w:hideMark/>
+          </w:tcPr>
+          <w:p>
+            <w:proofErr w:type="spellStart"/>
+            <w:r>
+              <w:t>buffalo_m</w:t>
+            </w:r>
+            <w:proofErr w:type="spellEnd"/>
+          </w:p>
+        </w:tc>
+        <w:tc>
+          <w:tcPr>
+            <w:tcW w:w="0" w:type="auto"/>
+            <w:hideMark/>
+          </w:tcPr>
+          <w:p>
+            <w:r>
+              <w:t>Media-</w:t>
+            </w:r>
+            <w:proofErr w:type="spellStart"/>
+            <w:r>
+              <w:t>alta</w:t>
+            </w:r>
+            <w:proofErr w:type="spellEnd"/>
+          </w:p>
+        </w:tc>
+        <w:tc>
+          <w:tcPr>
+            <w:tcW w:w="0" w:type="auto"/>
+            <w:hideMark/>
+          </w:tcPr>
+          <w:p>
+            <w:r>
+              <w:t>Medio</w:t>
+            </w:r>
+          </w:p>
+        </w:tc>
+        <w:tc>
+          <w:tcPr>
+            <w:tcW w:w="0" w:type="auto"/>
+            <w:hideMark/>
+          </w:tcPr>
+          <w:p>
+            <w:r>
+              <w:t>Media</w:t>
+            </w:r>
+          </w:p>
+        </w:tc>
+        <w:tc>
+          <w:tcPr>
+            <w:tcW w:w="1912" w:type="dxa"/>
+            <w:hideMark/>
+          </w:tcPr>
+          <w:p>
+            <w:pPr>
+              <w:rPr>
+                <w:lang w:val="es-EC"/>
+              </w:rPr>
+            </w:pPr>
+            <w:r>
+              <w:rPr>
+                <w:lang w:val="es-EC"/>
+              </w:rPr>
+              <w:t>Balance entre precisión y rendimiento</w:t>
+            </w:r>
+          </w:p>
+        </w:tc>
+        <w:tc>
+          <w:tcPr>
+            <w:tcW w:w="1701" w:type="dxa"/>
+          </w:tcPr>
+          <w:p/>
+        </w:tc>
+      </w:tr>
+      <w:tr>
+        <w:tc>
+          <w:tcPr>
+            <w:tcW w:w="0" w:type="auto"/>
+            <w:hideMark/>
+          </w:tcPr>
+          <w:p>
+            <w:proofErr w:type="spellStart"/>
+            <w:r>
+              <w:t>buffalo_s</w:t>
+            </w:r>
+            <w:proofErr w:type="spellEnd"/>
+          </w:p>
+        </w:tc>
+        <w:tc>
+          <w:tcPr>
+            <w:tcW w:w="0" w:type="auto"/>
+            <w:hideMark/>
+          </w:tcPr>
+          <w:p>
+            <w:r>
+              <w:t>Media</w:t>
+            </w:r>
+          </w:p>
+        </w:tc>
+        <w:tc>
+          <w:tcPr>
+            <w:tcW w:w="0" w:type="auto"/>
+            <w:hideMark/>
+          </w:tcPr>
+          <w:p>
+            <w:r>
+              <w:t>Bajo</w:t>
+            </w:r>
+          </w:p>
+        </w:tc>
+        <w:tc>
+          <w:tcPr>
+            <w:tcW w:w="0" w:type="auto"/>
+            <w:hideMark/>
+          </w:tcPr>
+          <w:p>
+            <w:r>
+              <w:t>Alta</w:t>
+            </w:r>
+          </w:p>
+        </w:tc>
+        <w:tc>
+          <w:tcPr>
+            <w:tcW w:w="1912" w:type="dxa"/>
+            <w:hideMark/>
+          </w:tcPr>
+          <w:p>
+            <w:proofErr w:type="spellStart"/>
+            <w:r>
+              <w:t>Equipos</w:t>
+            </w:r>
+            <w:proofErr w:type="spellEnd"/>
+            <w:r>
+              <w:t xml:space="preserve"> </w:t>
+            </w:r>
+            <w:proofErr w:type="spellStart"/>
+            <w:r>
+              <w:t>limitados</w:t>
+            </w:r>
+            <w:proofErr w:type="spellEnd"/>
+            <w:r>
+              <w:t xml:space="preserve"> / </w:t>
+            </w:r>
+            <w:proofErr w:type="spellStart"/>
+            <w:r>
+              <w:t>alta</w:t>
+            </w:r>
+            <w:proofErr w:type="spellEnd"/>
+            <w:r>
+              <w:t xml:space="preserve"> </w:t>
+            </w:r>
+            <w:proofErr w:type="spellStart"/>
+            <w:r>
+              <w:t>concurrencia</w:t>
+            </w:r>
+            <w:proofErr w:type="spellEnd"/>
+          </w:p>
+        </w:tc>
+        <w:tc>
+          <w:tcPr>
+            <w:tcW w:w="1701" w:type="dxa"/>
+          </w:tcPr>
+          <w:p/>
+        </w:tc>
+      </w:tr>
+      <w:tr>
+        <w:tc>
+          <w:tcPr>
+            <w:tcW w:w="0" w:type="auto"/>
+            <w:hideMark/>
+          </w:tcPr>
+          <w:p>
+            <w:r>
+              <w:t>antelopev2</w:t>
+            </w:r>
+          </w:p>
+        </w:tc>
+        <w:tc>
+          <w:tcPr>
+            <w:tcW w:w="0" w:type="auto"/>
+            <w:hideMark/>
+          </w:tcPr>
+          <w:p>
+            <w:pPr>
+              <w:rPr>
+                <w:lang w:val="es-EC"/>
+              </w:rPr>
+            </w:pPr>
+            <w:r>
+              <w:rPr>
+                <w:lang w:val="es-EC"/>
+              </w:rPr>
+              <w:t>Alta (a veces muy alta)</w:t>
+            </w:r>
+          </w:p>
+        </w:tc>
+        <w:tc>
+          <w:tcPr>
+            <w:tcW w:w="0" w:type="auto"/>
+            <w:hideMark/>
+          </w:tcPr>
+          <w:p>
+            <w:r>
+              <w:t>Alto</w:t>
+            </w:r>
+          </w:p>
+        </w:tc>
+        <w:tc>
+          <w:tcPr>
+            <w:tcW w:w="0" w:type="auto"/>
+            <w:hideMark/>
+          </w:tcPr>
+          <w:p>
+            <w:r>
+              <w:t>Baja-media</w:t>
+            </w:r>
+          </w:p>
+        </w:tc>
+        <w:tc>
+          <w:tcPr>
+            <w:tcW w:w="1912" w:type="dxa"/>
+            <w:hideMark/>
+          </w:tcPr>
+          <w:p>
+            <w:pPr>
+              <w:rPr>
+                <w:lang w:val="es-EC"/>
+              </w:rPr>
+            </w:pPr>
+            <w:r>
+              <w:rPr>
+                <w:lang w:val="es-EC"/>
+              </w:rPr>
+              <w:t>Casos más exigentes de calidad</w:t>
+            </w:r>
+          </w:p>
+        </w:tc>
+        <w:tc>
+          <w:tcPr>
+            <w:tcW w:w="1701" w:type="dxa"/>
+          </w:tcPr>
+          <w:p/>
+        </w:tc>
+      </w:tr>
+    </w:tbl>
     <w:p>
       <w:pPr>
         <w:spacing w:after="0" w:line="240" w:lineRule="auto"/>
-        <w:ind w:left="360"/>
         <w:rPr>
+          <w:u w:val="single"/>
           <w:lang w:val="es-EC"/>
         </w:rPr>
       </w:pPr>
@@ -25190,7 +24415,7 @@
 </file>
 
 <file path=word/numbering.xml><?xml version="1.0" encoding="utf-8"?>
-<w:numbering xmlns:wpc="http://schemas.microsoft.com/office/word/2010/wordprocessingCanvas" xmlns:cx="http://schemas.microsoft.com/office/drawing/2014/chartex" xmlns:mc="http://schemas.openxmlformats.org/markup-compatibility/2006" xmlns:o="urn:schemas-microsoft-com:office:office" xmlns:r="http://schemas.openxmlformats.org/officeDocument/2006/relationships" xmlns:m="http://schemas.openxmlformats.org/officeDocument/2006/math" xmlns:v="urn:schemas-microsoft-com:vml" xmlns:wp14="http://schemas.microsoft.com/office/word/2010/wordprocessingDrawing" xmlns:wp="http://schemas.openxmlformats.org/drawingml/2006/wordprocessingDrawing" xmlns:w10="urn:schemas-microsoft-com:office:word" xmlns:w="http://schemas.openxmlformats.org/wordprocessingml/2006/main" xmlns:w14="http://schemas.microsoft.com/office/word/2010/wordml" xmlns:w15="http://schemas.microsoft.com/office/word/2012/wordml" xmlns:w16se="http://schemas.microsoft.com/office/word/2015/wordml/symex" xmlns:wpg="http://schemas.microsoft.com/office/word/2010/wordprocessingGroup" xmlns:wpi="http://schemas.microsoft.com/office/word/2010/wordprocessingInk" xmlns:wne="http://schemas.microsoft.com/office/word/2006/wordml" xmlns:wps="http://schemas.microsoft.com/office/word/2010/wordprocessingShape" mc:Ignorable="w14 w15 w16se wp14">
+<w:numbering xmlns:wpc="http://schemas.microsoft.com/office/word/2010/wordprocessingCanvas" xmlns:cx="http://schemas.microsoft.com/office/drawing/2014/chartex" xmlns:cx1="http://schemas.microsoft.com/office/drawing/2015/9/8/chartex" xmlns:cx2="http://schemas.microsoft.com/office/drawing/2015/10/21/chartex" xmlns:cx3="http://schemas.microsoft.com/office/drawing/2016/5/9/chartex" xmlns:cx4="http://schemas.microsoft.com/office/drawing/2016/5/10/chartex" xmlns:cx5="http://schemas.microsoft.com/office/drawing/2016/5/11/chartex" xmlns:cx6="http://schemas.microsoft.com/office/drawing/2016/5/12/chartex" xmlns:cx7="http://schemas.microsoft.com/office/drawing/2016/5/13/chartex" xmlns:cx8="http://schemas.microsoft.com/office/drawing/2016/5/14/chartex" xmlns:mc="http://schemas.openxmlformats.org/markup-compatibility/2006" xmlns:aink="http://schemas.microsoft.com/office/drawing/2016/ink" xmlns:am3d="http://schemas.microsoft.com/office/drawing/2017/model3d" xmlns:o="urn:schemas-microsoft-com:office:office" xmlns:oel="http://schemas.microsoft.com/office/2019/extlst" xmlns:r="http://schemas.openxmlformats.org/officeDocument/2006/relationships" xmlns:m="http://schemas.openxmlformats.org/officeDocument/2006/math" xmlns:v="urn:schemas-microsoft-com:vml" xmlns:wp14="http://schemas.microsoft.com/office/word/2010/wordprocessingDrawing" xmlns:wp="http://schemas.openxmlformats.org/drawingml/2006/wordprocessingDrawing" xmlns:w10="urn:schemas-microsoft-com:office:word" xmlns:w="http://schemas.openxmlformats.org/wordprocessingml/2006/main" xmlns:w14="http://schemas.microsoft.com/office/word/2010/wordml" xmlns:w15="http://schemas.microsoft.com/office/word/2012/wordml" xmlns:w16cex="http://schemas.microsoft.com/office/word/2018/wordml/cex" xmlns:w16cid="http://schemas.microsoft.com/office/word/2016/wordml/cid" xmlns:w16="http://schemas.microsoft.com/office/word/2018/wordml" xmlns:w16du="http://schemas.microsoft.com/office/word/2023/wordml/word16du" xmlns:w16sdtdh="http://schemas.microsoft.com/office/word/2020/wordml/sdtdatahash" xmlns:w16sdtfl="http://schemas.microsoft.com/office/word/2024/wordml/sdtformatlock" xmlns:w16se="http://schemas.microsoft.com/office/word/2015/wordml/symex" xmlns:wpg="http://schemas.microsoft.com/office/word/2010/wordprocessingGroup" xmlns:wpi="http://schemas.microsoft.com/office/word/2010/wordprocessingInk" xmlns:wne="http://schemas.microsoft.com/office/word/2006/wordml" xmlns:wps="http://schemas.microsoft.com/office/word/2010/wordprocessingShape" mc:Ignorable="w14 w15 w16se w16cid w16 w16cex w16sdtdh w16sdtfl w16du wp14">
   <w:abstractNum w:abstractNumId="0" w15:restartNumberingAfterBreak="0">
     <w:nsid w:val="26FD724D"/>
     <w:multiLevelType w:val="hybridMultilevel"/>
@@ -25393,17 +24618,17 @@
       </w:rPr>
     </w:lvl>
   </w:abstractNum>
-  <w:num w:numId="1">
+  <w:num w:numId="1" w16cid:durableId="210308861">
     <w:abstractNumId w:val="1"/>
   </w:num>
-  <w:num w:numId="2">
+  <w:num w:numId="2" w16cid:durableId="1863712801">
     <w:abstractNumId w:val="0"/>
   </w:num>
 </w:numbering>
 </file>
 
 <file path=word/styles.xml><?xml version="1.0" encoding="utf-8"?>
-<w:styles xmlns:mc="http://schemas.openxmlformats.org/markup-compatibility/2006" xmlns:r="http://schemas.openxmlformats.org/officeDocument/2006/relationships" xmlns:w="http://schemas.openxmlformats.org/wordprocessingml/2006/main" xmlns:w14="http://schemas.microsoft.com/office/word/2010/wordml" xmlns:w15="http://schemas.microsoft.com/office/word/2012/wordml" xmlns:w16se="http://schemas.microsoft.com/office/word/2015/wordml/symex" mc:Ignorable="w14 w15 w16se">
+<w:styles xmlns:mc="http://schemas.openxmlformats.org/markup-compatibility/2006" xmlns:r="http://schemas.openxmlformats.org/officeDocument/2006/relationships" xmlns:w="http://schemas.openxmlformats.org/wordprocessingml/2006/main" xmlns:w14="http://schemas.microsoft.com/office/word/2010/wordml" xmlns:w15="http://schemas.microsoft.com/office/word/2012/wordml" xmlns:w16cex="http://schemas.microsoft.com/office/word/2018/wordml/cex" xmlns:w16cid="http://schemas.microsoft.com/office/word/2016/wordml/cid" xmlns:w16="http://schemas.microsoft.com/office/word/2018/wordml" xmlns:w16du="http://schemas.microsoft.com/office/word/2023/wordml/word16du" xmlns:w16sdtdh="http://schemas.microsoft.com/office/word/2020/wordml/sdtdatahash" xmlns:w16sdtfl="http://schemas.microsoft.com/office/word/2024/wordml/sdtformatlock" xmlns:w16se="http://schemas.microsoft.com/office/word/2015/wordml/symex" mc:Ignorable="w14 w15 w16se w16cid w16 w16cex w16sdtdh w16sdtfl w16du">
   <w:docDefaults>
     <w:rPrDefault>
       <w:rPr>
@@ -25419,7 +24644,7 @@
       </w:pPr>
     </w:pPrDefault>
   </w:docDefaults>
-  <w:latentStyles w:defLockedState="0" w:defUIPriority="99" w:defSemiHidden="0" w:defUnhideWhenUsed="0" w:defQFormat="0" w:count="371">
+  <w:latentStyles w:defLockedState="0" w:defUIPriority="99" w:defSemiHidden="0" w:defUnhideWhenUsed="0" w:defQFormat="0" w:count="376">
     <w:lsdException w:name="Normal" w:uiPriority="0" w:qFormat="1"/>
     <w:lsdException w:name="heading 1" w:uiPriority="9" w:qFormat="1"/>
     <w:lsdException w:name="heading 2" w:semiHidden="1" w:uiPriority="9" w:unhideWhenUsed="1" w:qFormat="1"/>
@@ -25791,6 +25016,11 @@
     <w:lsdException w:name="List Table 5 Dark Accent 6" w:uiPriority="50"/>
     <w:lsdException w:name="List Table 6 Colorful Accent 6" w:uiPriority="51"/>
     <w:lsdException w:name="List Table 7 Colorful Accent 6" w:uiPriority="52"/>
+    <w:lsdException w:name="Mention" w:semiHidden="1" w:unhideWhenUsed="1"/>
+    <w:lsdException w:name="Smart Hyperlink" w:semiHidden="1" w:unhideWhenUsed="1"/>
+    <w:lsdException w:name="Hashtag" w:semiHidden="1" w:unhideWhenUsed="1"/>
+    <w:lsdException w:name="Unresolved Mention" w:semiHidden="1" w:unhideWhenUsed="1"/>
+    <w:lsdException w:name="Smart Link" w:semiHidden="1" w:unhideWhenUsed="1"/>
   </w:latentStyles>
   <w:style w:type="paragraph" w:default="1" w:styleId="Normal">
     <w:name w:val="Normal"/>
@@ -25800,7 +25030,6 @@
   <w:style w:type="character" w:default="1" w:styleId="Fuentedeprrafopredeter">
     <w:name w:val="Default Paragraph Font"/>
     <w:uiPriority w:val="1"/>
-    <w:semiHidden/>
     <w:unhideWhenUsed/>
   </w:style>
   <w:style w:type="table" w:default="1" w:styleId="Tablanormal">
@@ -25845,6 +25074,25 @@
       <w:color w:val="0563C1" w:themeColor="hyperlink"/>
       <w:u w:val="single"/>
     </w:rPr>
+  </w:style>
+  <w:style w:type="table" w:styleId="Tablaconcuadrcula">
+    <w:name w:val="Table Grid"/>
+    <w:basedOn w:val="Tablanormal"/>
+    <w:uiPriority w:val="39"/>
+    <w:rsid w:val="004F1557"/>
+    <w:pPr>
+      <w:spacing w:after="0" w:line="240" w:lineRule="auto"/>
+    </w:pPr>
+    <w:tblPr>
+      <w:tblBorders>
+        <w:top w:val="single" w:sz="4" w:space="0" w:color="auto"/>
+        <w:left w:val="single" w:sz="4" w:space="0" w:color="auto"/>
+        <w:bottom w:val="single" w:sz="4" w:space="0" w:color="auto"/>
+        <w:right w:val="single" w:sz="4" w:space="0" w:color="auto"/>
+        <w:insideH w:val="single" w:sz="4" w:space="0" w:color="auto"/>
+        <w:insideV w:val="single" w:sz="4" w:space="0" w:color="auto"/>
+      </w:tblBorders>
+    </w:tblPr>
   </w:style>
 </w:styles>
 </file>

</xml_diff>